<commit_message>
Henvendelser fra Bliv ringet op: side under Salg, klokke, hjaelp, privatliv og fortegnelse
</commit_message>
<xml_diff>
--- a/overdragelse/Fortegnelse-behandlingsaktiviteter.docx
+++ b/overdragelse/Fortegnelse-behandlingsaktiviteter.docx
@@ -5096,6 +5096,423 @@
                 <w:szCs w:val="19"/>
               </w:rPr>
               <w:t xml:space="preserve">Tilmeldingen slettes automatisk, når telefonen ikke svarer længere — typisk fordi appen er afinstalleret.</w:t>
+            </w:r>
+          </w:p>
+        </w:tc>
+      </w:tr>
+    </w:tbl>
+    <w:p>
+      <w:pPr>
+        <w:pStyle w:val="Heading2"/>
+        <w:spacing w:after="120" w:before="260"/>
+      </w:pPr>
+      <w:r>
+        <w:rPr>
+          <w:rFonts w:ascii="Calibri" w:cs="Calibri" w:eastAsia="Calibri" w:hAnsi="Calibri"/>
+          <w:b/>
+          <w:bCs/>
+          <w:color w:val="1F2937"/>
+          <w:sz w:val="24"/>
+          <w:szCs w:val="24"/>
+        </w:rPr>
+        <w:t>3.8. Henvendelser fra borgere — «Bliv ringet op»</w:t>
+      </w:r>
+    </w:p>
+    <w:tbl>
+      <w:tblPr>
+        <w:tblW w:type="dxa" w:w="9026"/>
+        <w:tblBorders>
+          <w:top w:val="single" w:color="D9DDE3" w:sz="4"/>
+          <w:left w:val="single" w:color="D9DDE3" w:sz="4"/>
+          <w:bottom w:val="single" w:color="D9DDE3" w:sz="4"/>
+          <w:right w:val="single" w:color="D9DDE3" w:sz="4"/>
+          <w:insideH w:val="single" w:color="auto" w:sz="4"/>
+          <w:insideV w:val="single" w:color="auto" w:sz="4"/>
+        </w:tblBorders>
+      </w:tblPr>
+      <w:tblGrid>
+        <w:gridCol w:w="2300"/>
+        <w:gridCol w:w="6726"/>
+      </w:tblGrid>
+      <w:tr>
+        <w:tc>
+          <w:tcPr>
+            <w:tcW w:type="dxa" w:w="2300"/>
+            <w:shd w:fill="FAFAFA" w:color="auto" w:val="clear"/>
+            <w:tcMar>
+              <w:top w:type="dxa" w:w="90"/>
+              <w:left w:type="dxa" w:w="120"/>
+              <w:bottom w:type="dxa" w:w="90"/>
+              <w:right w:type="dxa" w:w="120"/>
+            </w:tcMar>
+          </w:tcPr>
+          <w:p>
+            <w:pPr>
+              <w:spacing w:after="40" w:line="264"/>
+            </w:pPr>
+            <w:r>
+              <w:rPr>
+                <w:rFonts w:ascii="Calibri" w:cs="Calibri" w:eastAsia="Calibri" w:hAnsi="Calibri"/>
+                <w:b/>
+                <w:bCs/>
+                <w:sz w:val="19"/>
+                <w:szCs w:val="19"/>
+              </w:rPr>
+              <w:t>Rolle</w:t>
+            </w:r>
+          </w:p>
+        </w:tc>
+        <w:tc>
+          <w:tcPr>
+            <w:tcW w:type="dxa" w:w="6726"/>
+            <w:tcMar>
+              <w:top w:type="dxa" w:w="90"/>
+              <w:left w:type="dxa" w:w="120"/>
+              <w:bottom w:type="dxa" w:w="90"/>
+              <w:right w:type="dxa" w:w="120"/>
+            </w:tcMar>
+          </w:tcPr>
+          <w:p>
+            <w:pPr>
+              <w:spacing w:after="40" w:line="264"/>
+            </w:pPr>
+            <w:r>
+              <w:rPr>
+                <w:rFonts w:ascii="Calibri" w:cs="Calibri" w:eastAsia="Calibri" w:hAnsi="Calibri"/>
+                <w:sz w:val="19"/>
+                <w:szCs w:val="19"/>
+              </w:rPr>
+              <w:t>Dataansvarlig</w:t>
+            </w:r>
+          </w:p>
+        </w:tc>
+      </w:tr>
+      <w:tr>
+        <w:tc>
+          <w:tcPr>
+            <w:tcW w:type="dxa" w:w="2300"/>
+            <w:shd w:fill="FAFAFA" w:color="auto" w:val="clear"/>
+            <w:tcMar>
+              <w:top w:type="dxa" w:w="90"/>
+              <w:left w:type="dxa" w:w="120"/>
+              <w:bottom w:type="dxa" w:w="90"/>
+              <w:right w:type="dxa" w:w="120"/>
+            </w:tcMar>
+          </w:tcPr>
+          <w:p>
+            <w:pPr>
+              <w:spacing w:after="40" w:line="264"/>
+            </w:pPr>
+            <w:r>
+              <w:rPr>
+                <w:rFonts w:ascii="Calibri" w:cs="Calibri" w:eastAsia="Calibri" w:hAnsi="Calibri"/>
+                <w:b/>
+                <w:bCs/>
+                <w:sz w:val="19"/>
+                <w:szCs w:val="19"/>
+              </w:rPr>
+              <w:t>Formål</w:t>
+            </w:r>
+          </w:p>
+        </w:tc>
+        <w:tc>
+          <w:tcPr>
+            <w:tcW w:type="dxa" w:w="6726"/>
+            <w:tcMar>
+              <w:top w:type="dxa" w:w="90"/>
+              <w:left w:type="dxa" w:w="120"/>
+              <w:bottom w:type="dxa" w:w="90"/>
+              <w:right w:type="dxa" w:w="120"/>
+            </w:tcMar>
+          </w:tcPr>
+          <w:p>
+            <w:pPr>
+              <w:spacing w:after="40" w:line="264"/>
+            </w:pPr>
+            <w:r>
+              <w:rPr>
+                <w:rFonts w:ascii="Calibri" w:cs="Calibri" w:eastAsia="Calibri" w:hAnsi="Calibri"/>
+                <w:sz w:val="19"/>
+                <w:szCs w:val="19"/>
+              </w:rPr>
+              <w:t>At ringe borgere op, som har bedt om det via QR-koden i pjecen (siden /bestil i kundeportalen), og fortælle om vores ydelser.</w:t>
+            </w:r>
+          </w:p>
+        </w:tc>
+      </w:tr>
+      <w:tr>
+        <w:tc>
+          <w:tcPr>
+            <w:tcW w:type="dxa" w:w="2300"/>
+            <w:shd w:fill="FAFAFA" w:color="auto" w:val="clear"/>
+            <w:tcMar>
+              <w:top w:type="dxa" w:w="90"/>
+              <w:left w:type="dxa" w:w="120"/>
+              <w:bottom w:type="dxa" w:w="90"/>
+              <w:right w:type="dxa" w:w="120"/>
+            </w:tcMar>
+          </w:tcPr>
+          <w:p>
+            <w:pPr>
+              <w:spacing w:after="40" w:line="264"/>
+            </w:pPr>
+            <w:r>
+              <w:rPr>
+                <w:rFonts w:ascii="Calibri" w:cs="Calibri" w:eastAsia="Calibri" w:hAnsi="Calibri"/>
+                <w:b/>
+                <w:bCs/>
+                <w:sz w:val="19"/>
+                <w:szCs w:val="19"/>
+              </w:rPr>
+              <w:t>Registrerede</w:t>
+            </w:r>
+          </w:p>
+        </w:tc>
+        <w:tc>
+          <w:tcPr>
+            <w:tcW w:type="dxa" w:w="6726"/>
+            <w:tcMar>
+              <w:top w:type="dxa" w:w="90"/>
+              <w:left w:type="dxa" w:w="120"/>
+              <w:bottom w:type="dxa" w:w="90"/>
+              <w:right w:type="dxa" w:w="120"/>
+            </w:tcMar>
+          </w:tcPr>
+          <w:p>
+            <w:pPr>
+              <w:spacing w:after="40" w:line="264"/>
+            </w:pPr>
+            <w:r>
+              <w:rPr>
+                <w:rFonts w:ascii="Calibri" w:cs="Calibri" w:eastAsia="Calibri" w:hAnsi="Calibri"/>
+                <w:sz w:val="19"/>
+                <w:szCs w:val="19"/>
+              </w:rPr>
+              <w:t>Borgere, der endnu ikke er kunder — typisk ældre, som får praktisk hjælp fra kommunen.</w:t>
+            </w:r>
+          </w:p>
+        </w:tc>
+      </w:tr>
+      <w:tr>
+        <w:tc>
+          <w:tcPr>
+            <w:tcW w:type="dxa" w:w="2300"/>
+            <w:shd w:fill="FAFAFA" w:color="auto" w:val="clear"/>
+            <w:tcMar>
+              <w:top w:type="dxa" w:w="90"/>
+              <w:left w:type="dxa" w:w="120"/>
+              <w:bottom w:type="dxa" w:w="90"/>
+              <w:right w:type="dxa" w:w="120"/>
+            </w:tcMar>
+          </w:tcPr>
+          <w:p>
+            <w:pPr>
+              <w:spacing w:after="40" w:line="264"/>
+            </w:pPr>
+            <w:r>
+              <w:rPr>
+                <w:rFonts w:ascii="Calibri" w:cs="Calibri" w:eastAsia="Calibri" w:hAnsi="Calibri"/>
+                <w:b/>
+                <w:bCs/>
+                <w:sz w:val="19"/>
+                <w:szCs w:val="19"/>
+              </w:rPr>
+              <w:t>Kategorier af oplysninger</w:t>
+            </w:r>
+          </w:p>
+        </w:tc>
+        <w:tc>
+          <w:tcPr>
+            <w:tcW w:type="dxa" w:w="6726"/>
+            <w:tcMar>
+              <w:top w:type="dxa" w:w="90"/>
+              <w:left w:type="dxa" w:w="120"/>
+              <w:bottom w:type="dxa" w:w="90"/>
+              <w:right w:type="dxa" w:w="120"/>
+            </w:tcMar>
+          </w:tcPr>
+          <w:p>
+            <w:pPr>
+              <w:spacing w:after="40" w:line="264"/>
+            </w:pPr>
+            <w:r>
+              <w:rPr>
+                <w:rFonts w:ascii="Calibri" w:cs="Calibri" w:eastAsia="Calibri" w:hAnsi="Calibri"/>
+                <w:sz w:val="19"/>
+                <w:szCs w:val="19"/>
+              </w:rPr>
+              <w:t>Navn og telefonnummer (skal udfyldes). Frivilligt: hvornår vi må ringe, adresse, om borgeren får hjælp fra kommunen (ja/nej/ved ikke — ingen helbredsoplysninger), hvilke ydelser borgeren er interesseret i, og en fritekst. Kontorets status og note. Ingen IP-adresse eller andet om enheden. Tabel: henvendelser.</w:t>
+            </w:r>
+          </w:p>
+        </w:tc>
+      </w:tr>
+      <w:tr>
+        <w:tc>
+          <w:tcPr>
+            <w:tcW w:type="dxa" w:w="2300"/>
+            <w:shd w:fill="FAFAFA" w:color="auto" w:val="clear"/>
+            <w:tcMar>
+              <w:top w:type="dxa" w:w="90"/>
+              <w:left w:type="dxa" w:w="120"/>
+              <w:bottom w:type="dxa" w:w="90"/>
+              <w:right w:type="dxa" w:w="120"/>
+            </w:tcMar>
+          </w:tcPr>
+          <w:p>
+            <w:pPr>
+              <w:spacing w:after="40" w:line="264"/>
+            </w:pPr>
+            <w:r>
+              <w:rPr>
+                <w:rFonts w:ascii="Calibri" w:cs="Calibri" w:eastAsia="Calibri" w:hAnsi="Calibri"/>
+                <w:b/>
+                <w:bCs/>
+                <w:sz w:val="19"/>
+                <w:szCs w:val="19"/>
+              </w:rPr>
+              <w:t>Modtagere</w:t>
+            </w:r>
+          </w:p>
+        </w:tc>
+        <w:tc>
+          <w:tcPr>
+            <w:tcW w:type="dxa" w:w="6726"/>
+            <w:tcMar>
+              <w:top w:type="dxa" w:w="90"/>
+              <w:left w:type="dxa" w:w="120"/>
+              <w:bottom w:type="dxa" w:w="90"/>
+              <w:right w:type="dxa" w:w="120"/>
+            </w:tcMar>
+          </w:tcPr>
+          <w:p>
+            <w:pPr>
+              <w:spacing w:after="40" w:line="276"/>
+            </w:pPr>
+            <w:r>
+              <w:rPr>
+                <w:rFonts w:ascii="Calibri" w:cs="Calibri" w:eastAsia="Calibri" w:hAnsi="Calibri"/>
+                <w:sz w:val="21"/>
+                <w:szCs w:val="21"/>
+              </w:rPr>
+              <w:t>Brevo (mail til planlæggerne om, at der er en henvendelse). Ingen videregivelse til kommunen eller andre.</w:t>
+            </w:r>
+          </w:p>
+        </w:tc>
+      </w:tr>
+      <w:tr>
+        <w:tc>
+          <w:tcPr>
+            <w:tcW w:type="dxa" w:w="2300"/>
+            <w:shd w:fill="FAFAFA" w:color="auto" w:val="clear"/>
+            <w:tcMar>
+              <w:top w:type="dxa" w:w="90"/>
+              <w:left w:type="dxa" w:w="120"/>
+              <w:bottom w:type="dxa" w:w="90"/>
+              <w:right w:type="dxa" w:w="120"/>
+            </w:tcMar>
+          </w:tcPr>
+          <w:p>
+            <w:pPr>
+              <w:spacing w:after="40" w:line="264"/>
+            </w:pPr>
+            <w:r>
+              <w:rPr>
+                <w:rFonts w:ascii="Calibri" w:cs="Calibri" w:eastAsia="Calibri" w:hAnsi="Calibri"/>
+                <w:b/>
+                <w:bCs/>
+                <w:sz w:val="19"/>
+                <w:szCs w:val="19"/>
+              </w:rPr>
+              <w:t>Retsgrundlag</w:t>
+            </w:r>
+          </w:p>
+        </w:tc>
+        <w:tc>
+          <w:tcPr>
+            <w:tcW w:type="dxa" w:w="6726"/>
+            <w:tcMar>
+              <w:top w:type="dxa" w:w="90"/>
+              <w:left w:type="dxa" w:w="120"/>
+              <w:bottom w:type="dxa" w:w="90"/>
+              <w:right w:type="dxa" w:w="120"/>
+            </w:tcMar>
+          </w:tcPr>
+          <w:p>
+            <w:pPr>
+              <w:spacing w:after="0" w:line="276"/>
+            </w:pPr>
+            <w:r>
+              <w:rPr>
+                <w:rFonts w:ascii="Calibri" w:cs="Calibri" w:eastAsia="Calibri" w:hAnsi="Calibri"/>
+                <w:sz w:val="21"/>
+                <w:szCs w:val="21"/>
+              </w:rPr>
+              <w:t>Artikel 6, stk. 1, litra b — skridt på borgerens anmodning forud for en eventuel aftale. Borgeren beder selv om at blive ringet op.</w:t>
+            </w:r>
+            <w:r>
+              <w:rPr>
+                <w:rFonts w:ascii="Calibri" w:cs="Calibri" w:eastAsia="Calibri" w:hAnsi="Calibri"/>
+                <w:b/>
+                <w:bCs/>
+                <w:color w:val="B45309"/>
+                <w:sz w:val="21"/>
+                <w:szCs w:val="21"/>
+                <w:highlight w:val="yellow"/>
+                <w:highlightCs w:val="yellow"/>
+              </w:rPr>
+            </w:r>
+          </w:p>
+        </w:tc>
+      </w:tr>
+      <w:tr>
+        <w:tc>
+          <w:tcPr>
+            <w:tcW w:type="dxa" w:w="2300"/>
+            <w:shd w:fill="FAFAFA" w:color="auto" w:val="clear"/>
+            <w:tcMar>
+              <w:top w:type="dxa" w:w="90"/>
+              <w:left w:type="dxa" w:w="120"/>
+              <w:bottom w:type="dxa" w:w="90"/>
+              <w:right w:type="dxa" w:w="120"/>
+            </w:tcMar>
+          </w:tcPr>
+          <w:p>
+            <w:pPr>
+              <w:spacing w:after="40" w:line="264"/>
+            </w:pPr>
+            <w:r>
+              <w:rPr>
+                <w:rFonts w:ascii="Calibri" w:cs="Calibri" w:eastAsia="Calibri" w:hAnsi="Calibri"/>
+                <w:b/>
+                <w:bCs/>
+                <w:sz w:val="19"/>
+                <w:szCs w:val="19"/>
+              </w:rPr>
+              <w:t>Sletning</w:t>
+            </w:r>
+          </w:p>
+        </w:tc>
+        <w:tc>
+          <w:tcPr>
+            <w:tcW w:type="dxa" w:w="6726"/>
+            <w:tcMar>
+              <w:top w:type="dxa" w:w="90"/>
+              <w:left w:type="dxa" w:w="120"/>
+              <w:bottom w:type="dxa" w:w="90"/>
+              <w:right w:type="dxa" w:w="120"/>
+            </w:tcMar>
+          </w:tcPr>
+          <w:p>
+            <w:pPr>
+              <w:spacing w:after="40" w:line="264"/>
+            </w:pPr>
+            <w:r>
+              <w:rPr>
+                <w:rFonts w:ascii="Calibri" w:cs="Calibri" w:eastAsia="Calibri" w:hAnsi="Calibri"/>
+                <w:sz w:val="19"/>
+                <w:szCs w:val="19"/>
+              </w:rPr>
+              <w:t>Automatisk: 6 måneder efter at henvendelsen er afsluttet eller blevet til en kunde, og alle senest 12 måneder efter oprettelsen (job ryd-henvendelser kl. 03.45). Beder borgeren om sletning før, kan kontoret slette den med det samme under Salg → Henvendelser.</w:t>
             </w:r>
           </w:p>
         </w:tc>

</xml_diff>